<commit_message>
Synced all shared templates docx and yml - or tried to.
</commit_message>
<xml_diff>
--- a/docassemble/AKA2JBranding/data/templates/ak_jurisdiction_content.docx
+++ b/docassemble/AKA2JBranding/data/templates/ak_jurisdiction_content.docx
@@ -13,7 +13,19 @@
         <w:ind w:left="504"/>
       </w:pPr>
       <w:r>
-        <w:t>A court must have the authority called jurisdiction to issue an order about a custody or parenting plan or a child support order.</w:t>
+        <w:t xml:space="preserve">A court must have the authority called </w:t>
+      </w:r>
+      <w:r>
+        <w:t>"</w:t>
+      </w:r>
+      <w:r>
+        <w:t>jurisdiction</w:t>
+      </w:r>
+      <w:r>
+        <w:t>"</w:t>
+      </w:r>
+      <w:r>
+        <w:t xml:space="preserve"> to issue an order about a custody or parenting plan or a child support order.</w:t>
       </w:r>
     </w:p>
     <w:p>
@@ -165,16 +177,8 @@
           <w:rPr>
             <w:rStyle w:val="Hyperlink"/>
           </w:rPr>
-          <w:t>ak-courts.info/</w:t>
+          <w:t>ak-courts.info/findlawyer</w:t>
         </w:r>
-        <w:proofErr w:type="spellStart"/>
-        <w:r>
-          <w:rPr>
-            <w:rStyle w:val="Hyperlink"/>
-          </w:rPr>
-          <w:t>findlawyer</w:t>
-        </w:r>
-        <w:proofErr w:type="spellEnd"/>
       </w:hyperlink>
     </w:p>
     <w:sectPr>

</xml_diff>